<commit_message>
fix: embed diagrams in advisory DOCX export
Rebuild the DOCX converter to convert SVG diagrams to PNG and embed
them inline. The advisory DOCX now includes all three diagrams
(tier evaluation, CI/CD pipeline, team ownership) with centered
captions.
</commit_message>
<xml_diff>
--- a/lgtm-presentation/k8s-environment-policies.docx
+++ b/lgtm-presentation/k8s-environment-policies.docx
@@ -12,7 +12,12 @@
     </w:p>
     <w:p>
       <w:r>
-        <w:t>Governance, RBAC, NetworkPolicy, and GitOps guardrails for multi-environment Kubernetes clusters.</w:t>
+        <w:t>Governance, RBAC, NetworkPolicy, and GitOps guardrails for multi-environment</w:t>
+      </w:r>
+    </w:p>
+    <w:p>
+      <w:r>
+        <w:t>Kubernetes clusters.</w:t>
       </w:r>
     </w:p>
     <w:p>
@@ -25,16 +30,12 @@
     </w:p>
     <w:p>
       <w:r>
-        <w:t xml:space="preserve">Every team running Kubernetes eventually faces the same question: </w:t>
-      </w:r>
-      <w:r>
-        <w:rPr>
-          <w:b/>
-        </w:rPr>
-        <w:t>who can do what, in which environment?</w:t>
-      </w:r>
-      <w:r>
-        <w:t xml:space="preserve"> Without clear governance:</w:t>
+        <w:t>Every team running Kubernetes eventually faces the same question: **who can do what,</w:t>
+      </w:r>
+    </w:p>
+    <w:p>
+      <w:r>
+        <w:t>in which environment?** Without clear governance:</w:t>
       </w:r>
     </w:p>
     <w:p>
@@ -46,7 +47,8 @@
       </w:r>
       <w:r>
         <w:rPr>
-          <w:rFonts w:ascii="Courier New" w:hAnsi="Courier New"/>
+          <w:rFonts w:ascii="Consolas" w:hAnsi="Consolas"/>
+          <w:color w:val="CC0000"/>
           <w:sz w:val="20"/>
         </w:rPr>
         <w:t>kubectl delete namespace</w:t>
@@ -57,7 +59,7 @@
     </w:p>
     <w:p>
       <w:r>
-        <w:t>production.</w:t>
+        <w:t xml:space="preserve">  production.</w:t>
       </w:r>
     </w:p>
     <w:p>
@@ -86,12 +88,22 @@
     </w:p>
     <w:p>
       <w:r>
-        <w:t>in prod.</w:t>
+        <w:t xml:space="preserve">  in prod.</w:t>
       </w:r>
     </w:p>
     <w:p>
       <w:r>
-        <w:t>The cost of ungoverned access is measured in outages, security incidents, and audit failures. The fix is a layered policy model — RBAC, NetworkPolicy, admission control, and GitOps — applied differently per environment.</w:t>
+        <w:t>The cost of ungoverned access is measured in outages, security incidents, and audit</w:t>
+      </w:r>
+    </w:p>
+    <w:p>
+      <w:r>
+        <w:t>failures. The fix is a layered policy model — RBAC, NetworkPolicy, admission control,</w:t>
+      </w:r>
+    </w:p>
+    <w:p>
+      <w:r>
+        <w:t>and GitOps — applied differently per environment.</w:t>
       </w:r>
     </w:p>
     <w:p>
@@ -126,9 +138,6 @@
           </w:tcPr>
           <w:p>
             <w:r>
-              <w:rPr>
-                <w:b/>
-              </w:rPr>
               <w:t>Dimension</w:t>
             </w:r>
           </w:p>
@@ -139,9 +148,6 @@
           </w:tcPr>
           <w:p>
             <w:r>
-              <w:rPr>
-                <w:b/>
-              </w:rPr>
               <w:t>Dev</w:t>
             </w:r>
           </w:p>
@@ -152,9 +158,6 @@
           </w:tcPr>
           <w:p>
             <w:r>
-              <w:rPr>
-                <w:b/>
-              </w:rPr>
               <w:t>Test / Staging</w:t>
             </w:r>
           </w:p>
@@ -165,9 +168,6 @@
           </w:tcPr>
           <w:p>
             <w:r>
-              <w:rPr>
-                <w:b/>
-              </w:rPr>
               <w:t>Production</w:t>
             </w:r>
           </w:p>
@@ -437,7 +437,17 @@
         <w:t>freedom increases as risk decreases.</w:t>
       </w:r>
       <w:r>
-        <w:t xml:space="preserve"> Dev is the most permissive, prod is the most restrictive, and test mirrors prod's topology so that what passes test also passes prod.</w:t>
+        <w:t xml:space="preserve"> Dev is the most permissive,</w:t>
+      </w:r>
+    </w:p>
+    <w:p>
+      <w:r>
+        <w:t>prod is the most restrictive, and test mirrors prod's topology so that what passes</w:t>
+      </w:r>
+    </w:p>
+    <w:p>
+      <w:r>
+        <w:t>test also passes prod.</w:t>
       </w:r>
     </w:p>
     <w:p>
@@ -450,7 +460,12 @@
     </w:p>
     <w:p>
       <w:r>
-        <w:t>Kubernetes Role-Based Access Control (RBAC) is the primary mechanism for controlling who can perform which actions on which resources. It has four objects:</w:t>
+        <w:t>Kubernetes Role-Based Access Control (RBAC) is the primary mechanism for controlling</w:t>
+      </w:r>
+    </w:p>
+    <w:p>
+      <w:r>
+        <w:t>who can perform which actions on which resources. It has four objects:</w:t>
       </w:r>
     </w:p>
     <w:p>
@@ -483,7 +498,7 @@
     </w:p>
     <w:p>
       <w:r>
-        <w:t>RoleBindings).</w:t>
+        <w:t xml:space="preserve">  RoleBindings).</w:t>
       </w:r>
     </w:p>
     <w:p>
@@ -520,7 +535,8 @@
       </w:r>
       <w:r>
         <w:rPr>
-          <w:rFonts w:ascii="Courier New" w:hAnsi="Courier New"/>
+          <w:rFonts w:ascii="Consolas" w:hAnsi="Consolas"/>
+          <w:color w:val="CC0000"/>
           <w:sz w:val="20"/>
         </w:rPr>
         <w:t>get</w:t>
@@ -530,7 +546,8 @@
       </w:r>
       <w:r>
         <w:rPr>
-          <w:rFonts w:ascii="Courier New" w:hAnsi="Courier New"/>
+          <w:rFonts w:ascii="Consolas" w:hAnsi="Consolas"/>
+          <w:color w:val="CC0000"/>
           <w:sz w:val="20"/>
         </w:rPr>
         <w:t>list</w:t>
@@ -540,7 +557,8 @@
       </w:r>
       <w:r>
         <w:rPr>
-          <w:rFonts w:ascii="Courier New" w:hAnsi="Courier New"/>
+          <w:rFonts w:ascii="Consolas" w:hAnsi="Consolas"/>
+          <w:color w:val="CC0000"/>
           <w:sz w:val="20"/>
         </w:rPr>
         <w:t>watch</w:t>
@@ -550,7 +568,8 @@
       </w:r>
       <w:r>
         <w:rPr>
-          <w:rFonts w:ascii="Courier New" w:hAnsi="Courier New"/>
+          <w:rFonts w:ascii="Consolas" w:hAnsi="Consolas"/>
+          <w:color w:val="CC0000"/>
           <w:sz w:val="20"/>
         </w:rPr>
         <w:t>create</w:t>
@@ -560,7 +579,8 @@
       </w:r>
       <w:r>
         <w:rPr>
-          <w:rFonts w:ascii="Courier New" w:hAnsi="Courier New"/>
+          <w:rFonts w:ascii="Consolas" w:hAnsi="Consolas"/>
+          <w:color w:val="CC0000"/>
           <w:sz w:val="20"/>
         </w:rPr>
         <w:t>update</w:t>
@@ -570,23 +590,32 @@
       </w:r>
       <w:r>
         <w:rPr>
-          <w:rFonts w:ascii="Courier New" w:hAnsi="Courier New"/>
+          <w:rFonts w:ascii="Consolas" w:hAnsi="Consolas"/>
+          <w:color w:val="CC0000"/>
           <w:sz w:val="20"/>
         </w:rPr>
         <w:t>patch</w:t>
       </w:r>
       <w:r>
-        <w:t xml:space="preserve">, </w:t>
-      </w:r>
+        <w:t>,</w:t>
+      </w:r>
+    </w:p>
+    <w:p>
       <w:r>
         <w:rPr>
-          <w:rFonts w:ascii="Courier New" w:hAnsi="Courier New"/>
+          <w:rFonts w:ascii="Consolas" w:hAnsi="Consolas"/>
+          <w:color w:val="CC0000"/>
           <w:sz w:val="20"/>
         </w:rPr>
         <w:t>delete</w:t>
       </w:r>
       <w:r>
-        <w:t xml:space="preserve"> (write). The governance question is which verbs each persona gets in each environment.</w:t>
+        <w:t xml:space="preserve"> (write). The governance question is which verbs each persona gets in each</w:t>
+      </w:r>
+    </w:p>
+    <w:p>
+      <w:r>
+        <w:t>environment.</w:t>
       </w:r>
     </w:p>
     <w:p>
@@ -601,13 +630,25 @@
       </w:r>
       <w:r>
         <w:rPr>
-          <w:color w:val="00568B"/>
+          <w:color w:val="0066CC"/>
           <w:u w:val="single"/>
         </w:rPr>
         <w:t>Kubernetes RBAC Good Practices</w:t>
       </w:r>
-      <w:r>
-        <w:t xml:space="preserve"> recommends least privilege, no cluster-admin for humans, namespace-scoped roles over cluster roles, service accounts with minimal permissions, audit logging of all RBAC decisions, and quarterly review of bindings to remove stale access.</w:t>
+    </w:p>
+    <w:p>
+      <w:r>
+        <w:t>recommends least privilege, no cluster-admin for humans, namespace-scoped roles over</w:t>
+      </w:r>
+    </w:p>
+    <w:p>
+      <w:r>
+        <w:t>cluster roles, service accounts with minimal permissions, audit logging of all RBAC</w:t>
+      </w:r>
+    </w:p>
+    <w:p>
+      <w:r>
+        <w:t>decisions, and quarterly review of bindings to remove stale access.</w:t>
       </w:r>
     </w:p>
     <w:p>
@@ -637,9 +678,6 @@
           </w:tcPr>
           <w:p>
             <w:r>
-              <w:rPr>
-                <w:b/>
-              </w:rPr>
               <w:t>Resource</w:t>
             </w:r>
           </w:p>
@@ -650,9 +688,6 @@
           </w:tcPr>
           <w:p>
             <w:r>
-              <w:rPr>
-                <w:b/>
-              </w:rPr>
               <w:t>Dev</w:t>
             </w:r>
           </w:p>
@@ -663,9 +698,6 @@
           </w:tcPr>
           <w:p>
             <w:r>
-              <w:rPr>
-                <w:b/>
-              </w:rPr>
               <w:t>Test / Staging</w:t>
             </w:r>
           </w:p>
@@ -676,9 +708,6 @@
           </w:tcPr>
           <w:p>
             <w:r>
-              <w:rPr>
-                <w:b/>
-              </w:rPr>
               <w:t>Production</w:t>
             </w:r>
           </w:p>
@@ -945,7 +974,12 @@
         <w:t>Dev</w:t>
       </w:r>
       <w:r>
-        <w:t xml:space="preserve"> — full self-service within assigned namespaces. Developers can create, modify, and delete any workload or network policy. They learn by doing.</w:t>
+        <w:t xml:space="preserve"> — full self-service within assigned namespaces. Developers can create, modify,</w:t>
+      </w:r>
+    </w:p>
+    <w:p>
+      <w:r>
+        <w:t>and delete any workload or network policy. They learn by doing.</w:t>
       </w:r>
     </w:p>
     <w:p>
@@ -956,11 +990,17 @@
         <w:t>Test / Staging</w:t>
       </w:r>
       <w:r>
-        <w:t xml:space="preserve"> — developers can read everything but deploy only through the CI/CD pipeline. Manual </w:t>
+        <w:t xml:space="preserve"> — developers can read everything but deploy only through the CI/CD</w:t>
+      </w:r>
+    </w:p>
+    <w:p>
+      <w:r>
+        <w:t xml:space="preserve">pipeline. Manual </w:t>
       </w:r>
       <w:r>
         <w:rPr>
-          <w:rFonts w:ascii="Courier New" w:hAnsi="Courier New"/>
+          <w:rFonts w:ascii="Consolas" w:hAnsi="Consolas"/>
+          <w:color w:val="CC0000"/>
           <w:sz w:val="20"/>
         </w:rPr>
         <w:t>kubectl apply</w:t>
@@ -977,7 +1017,12 @@
         <w:t>Production</w:t>
       </w:r>
       <w:r>
-        <w:t xml:space="preserve"> — strictly read-only for all humans. Every change flows through a GitOps pipeline (ArgoCD or Flux) after passing automated validation.</w:t>
+        <w:t xml:space="preserve"> — strictly read-only for all humans. Every change flows through a</w:t>
+      </w:r>
+    </w:p>
+    <w:p>
+      <w:r>
+        <w:t>GitOps pipeline (ArgoCD or Flux) after passing automated validation.</w:t>
       </w:r>
     </w:p>
     <w:p>
@@ -988,11 +1033,17 @@
         <w:t>Practical tip:</w:t>
       </w:r>
       <w:r>
-        <w:t xml:space="preserve"> you do not need to write custom Roles. Kubernetes ships built-in ClusterRoles named </w:t>
+        <w:t xml:space="preserve"> you do not need to write custom Roles. Kubernetes ships built-in</w:t>
+      </w:r>
+    </w:p>
+    <w:p>
+      <w:r>
+        <w:t xml:space="preserve">ClusterRoles named </w:t>
       </w:r>
       <w:r>
         <w:rPr>
-          <w:rFonts w:ascii="Courier New" w:hAnsi="Courier New"/>
+          <w:rFonts w:ascii="Consolas" w:hAnsi="Consolas"/>
+          <w:color w:val="CC0000"/>
           <w:sz w:val="20"/>
         </w:rPr>
         <w:t>edit</w:t>
@@ -1002,13 +1053,16 @@
       </w:r>
       <w:r>
         <w:rPr>
-          <w:rFonts w:ascii="Courier New" w:hAnsi="Courier New"/>
+          <w:rFonts w:ascii="Consolas" w:hAnsi="Consolas"/>
+          <w:color w:val="CC0000"/>
           <w:sz w:val="20"/>
         </w:rPr>
         <w:t>view</w:t>
       </w:r>
-      <w:r>
-        <w:t xml:space="preserve"> (get, list, watch only). Bind them via </w:t>
+    </w:p>
+    <w:p>
+      <w:r>
+        <w:t xml:space="preserve">(get, list, watch only). Bind them via </w:t>
       </w:r>
       <w:r>
         <w:rPr>
@@ -1017,16 +1071,22 @@
         <w:t>RoleBinding</w:t>
       </w:r>
       <w:r>
-        <w:t xml:space="preserve"> (namespace-scoped), not ClusterRoleBinding, to keep permissions scoped to the team's namespace.</w:t>
+        <w:t xml:space="preserve"> (namespace-scoped), not</w:t>
+      </w:r>
+    </w:p>
+    <w:p>
+      <w:r>
+        <w:t>ClusterRoleBinding, to keep permissions scoped to the team's namespace.</w:t>
       </w:r>
     </w:p>
     <w:p>
       <w:pPr>
-        <w:spacing w:before="120" w:after="120"/>
+        <w:spacing w:after="160"/>
+        <w:shd w:fill="F5F5F5" w:val="clear"/>
       </w:pPr>
       <w:r>
         <w:rPr>
-          <w:rFonts w:ascii="Courier New" w:hAnsi="Courier New"/>
+          <w:rFonts w:ascii="Consolas" w:hAnsi="Consolas"/>
           <w:color w:val="333333"/>
           <w:sz w:val="18"/>
         </w:rPr>
@@ -1108,16 +1168,32 @@
         <w:t>default-deny</w:t>
       </w:r>
       <w:r>
-        <w:t xml:space="preserve"> rule in every namespace. With no NetworkPolicy, Kubernetes allows all traffic — any pod can reach any other pod in the cluster. A single default-deny policy flips that to "nothing is allowed unless explicitly permitted."</w:t>
+        <w:t xml:space="preserve"> rule in every namespace. With no</w:t>
+      </w:r>
+    </w:p>
+    <w:p>
+      <w:r>
+        <w:t>NetworkPolicy, Kubernetes allows all traffic — any pod can reach any other pod in the</w:t>
+      </w:r>
+    </w:p>
+    <w:p>
+      <w:r>
+        <w:t>cluster. A single default-deny policy flips that to "nothing is allowed unless</w:t>
+      </w:r>
+    </w:p>
+    <w:p>
+      <w:r>
+        <w:t>explicitly permitted."</w:t>
       </w:r>
     </w:p>
     <w:p>
       <w:pPr>
-        <w:spacing w:before="120" w:after="120"/>
+        <w:spacing w:after="160"/>
+        <w:shd w:fill="F5F5F5" w:val="clear"/>
       </w:pPr>
       <w:r>
         <w:rPr>
-          <w:rFonts w:ascii="Courier New" w:hAnsi="Courier New"/>
+          <w:rFonts w:ascii="Consolas" w:hAnsi="Consolas"/>
           <w:color w:val="333333"/>
           <w:sz w:val="18"/>
         </w:rPr>
@@ -1146,12 +1222,42 @@
     </w:p>
     <w:p>
       <w:r>
-        <w:t>After this baseline, developers write targeted policies to open only the connections their services need — port 5432 to the database, port 9092 to Kafka, port 8080 between specific services. Everything else is blocked.</w:t>
+        <w:t>After this baseline, developers write targeted policies to open only the connections</w:t>
       </w:r>
     </w:p>
     <w:p>
       <w:r>
-        <w:t>This is the single highest-impact security measure you can apply to a Kubernetes namespace. Without it, a compromised pod can scan and reach every service in the cluster. With it, a compromise is contained to the traffic the service was already authorized to send. Apply default-deny on day one of every new namespace, in every environment.</w:t>
+        <w:t>their services need — port 5432 to the database, port 9092 to Kafka, port 8080</w:t>
+      </w:r>
+    </w:p>
+    <w:p>
+      <w:r>
+        <w:t>between specific services. Everything else is blocked.</w:t>
+      </w:r>
+    </w:p>
+    <w:p>
+      <w:r>
+        <w:t>This is the single highest-impact security measure you can apply to a Kubernetes</w:t>
+      </w:r>
+    </w:p>
+    <w:p>
+      <w:r>
+        <w:t>namespace. Without it, a compromised pod can scan and reach every service in the</w:t>
+      </w:r>
+    </w:p>
+    <w:p>
+      <w:r>
+        <w:t>cluster. With it, a compromise is contained to the traffic the service was already</w:t>
+      </w:r>
+    </w:p>
+    <w:p>
+      <w:r>
+        <w:t>authorized to send. Apply default-deny on day one of every new namespace, in every</w:t>
+      </w:r>
+    </w:p>
+    <w:p>
+      <w:r>
+        <w:t>environment.</w:t>
       </w:r>
     </w:p>
     <w:p>
@@ -1173,7 +1279,12 @@
         <w:t>allow rules</w:t>
       </w:r>
       <w:r>
-        <w:t xml:space="preserve"> differ by environment:</w:t>
+        <w:t xml:space="preserve"> differ by</w:t>
+      </w:r>
+    </w:p>
+    <w:p>
+      <w:r>
+        <w:t>environment:</w:t>
       </w:r>
     </w:p>
     <w:p>
@@ -1184,7 +1295,17 @@
         <w:t>Dev</w:t>
       </w:r>
       <w:r>
-        <w:t xml:space="preserve"> — permissive within the namespace. Allow all intra-namespace traffic so developers can wire up services without filing tickets. Block cross-namespace traffic to prevent accidental dependencies on other teams' dev environments.</w:t>
+        <w:t xml:space="preserve"> — permissive within the namespace. Allow all intra-namespace traffic so</w:t>
+      </w:r>
+    </w:p>
+    <w:p>
+      <w:r>
+        <w:t>developers can wire up services without filing tickets. Block cross-namespace traffic</w:t>
+      </w:r>
+    </w:p>
+    <w:p>
+      <w:r>
+        <w:t>to prevent accidental dependencies on other teams' dev environments.</w:t>
       </w:r>
     </w:p>
     <w:p>
@@ -1195,7 +1316,17 @@
         <w:t>Test / Staging</w:t>
       </w:r>
       <w:r>
-        <w:t xml:space="preserve"> — mirror production's network topology exactly. If production only allows order → inventory on port 8080, test should enforce the same rule. This catches misconfigurations before they reach prod.</w:t>
+        <w:t xml:space="preserve"> — mirror production's network topology exactly. If production only</w:t>
+      </w:r>
+    </w:p>
+    <w:p>
+      <w:r>
+        <w:t>allows order → inventory on port 8080, test should enforce the same rule. This catches</w:t>
+      </w:r>
+    </w:p>
+    <w:p>
+      <w:r>
+        <w:t>misconfigurations before they reach prod.</w:t>
       </w:r>
     </w:p>
     <w:p>
@@ -1206,16 +1337,27 @@
         <w:t>Production</w:t>
       </w:r>
       <w:r>
-        <w:t xml:space="preserve"> — strict micro-segmentation. Each service-to-service connection is explicitly allowed by label selector, port, and protocol. Egress to external services is allow-listed by CIDR or DNS. Everything else is denied.</w:t>
+        <w:t xml:space="preserve"> — strict micro-segmentation. Each service-to-service connection is</w:t>
+      </w:r>
+    </w:p>
+    <w:p>
+      <w:r>
+        <w:t>explicitly allowed by label selector, port, and protocol. Egress to external services</w:t>
+      </w:r>
+    </w:p>
+    <w:p>
+      <w:r>
+        <w:t>is allow-listed by CIDR or DNS. Everything else is denied.</w:t>
       </w:r>
     </w:p>
     <w:p>
       <w:pPr>
-        <w:spacing w:before="120" w:after="120"/>
+        <w:spacing w:after="160"/>
+        <w:shd w:fill="F5F5F5" w:val="clear"/>
       </w:pPr>
       <w:r>
         <w:rPr>
-          <w:rFonts w:ascii="Courier New" w:hAnsi="Courier New"/>
+          <w:rFonts w:ascii="Consolas" w:hAnsi="Consolas"/>
           <w:color w:val="333333"/>
           <w:sz w:val="18"/>
         </w:rPr>
@@ -1273,7 +1415,17 @@
         <w:t>admission control</w:t>
       </w:r>
       <w:r>
-        <w:t xml:space="preserve"> controls what they can create. OPA Gatekeeper (or Kyverno) evaluates every object submitted to the API server against a set of policies written as code:</w:t>
+        <w:t xml:space="preserve"> controls what they can create.</w:t>
+      </w:r>
+    </w:p>
+    <w:p>
+      <w:r>
+        <w:t>OPA Gatekeeper (or Kyverno) evaluates every object submitted to the API server</w:t>
+      </w:r>
+    </w:p>
+    <w:p>
+      <w:r>
+        <w:t>against a set of policies written as code:</w:t>
       </w:r>
     </w:p>
     <w:p>
@@ -1291,7 +1443,8 @@
       </w:r>
       <w:r>
         <w:rPr>
-          <w:rFonts w:ascii="Courier New" w:hAnsi="Courier New"/>
+          <w:rFonts w:ascii="Consolas" w:hAnsi="Consolas"/>
+          <w:color w:val="CC0000"/>
           <w:sz w:val="20"/>
         </w:rPr>
         <w:t>docker.io/random:latest</w:t>
@@ -1315,7 +1468,8 @@
       </w:r>
       <w:r>
         <w:rPr>
-          <w:rFonts w:ascii="Courier New" w:hAnsi="Courier New"/>
+          <w:rFonts w:ascii="Consolas" w:hAnsi="Consolas"/>
+          <w:color w:val="CC0000"/>
           <w:sz w:val="20"/>
         </w:rPr>
         <w:t>securityContext.privileged: true</w:t>
@@ -1353,7 +1507,8 @@
       </w:r>
       <w:r>
         <w:rPr>
-          <w:rFonts w:ascii="Courier New" w:hAnsi="Courier New"/>
+          <w:rFonts w:ascii="Consolas" w:hAnsi="Consolas"/>
+          <w:color w:val="CC0000"/>
           <w:sz w:val="20"/>
         </w:rPr>
         <w:t>env: dev|test|prod</w:t>
@@ -1361,11 +1516,12 @@
     </w:p>
     <w:p>
       <w:r>
-        <w:t xml:space="preserve">and </w:t>
+        <w:t xml:space="preserve">  and </w:t>
       </w:r>
       <w:r>
         <w:rPr>
-          <w:rFonts w:ascii="Courier New" w:hAnsi="Courier New"/>
+          <w:rFonts w:ascii="Consolas" w:hAnsi="Consolas"/>
+          <w:color w:val="CC0000"/>
           <w:sz w:val="20"/>
         </w:rPr>
         <w:t>team: &lt;team-name&gt;</w:t>
@@ -1380,7 +1536,8 @@
       </w:r>
       <w:r>
         <w:rPr>
-          <w:rFonts w:ascii="Courier New" w:hAnsi="Courier New"/>
+          <w:rFonts w:ascii="Consolas" w:hAnsi="Consolas"/>
+          <w:color w:val="CC0000"/>
           <w:sz w:val="20"/>
         </w:rPr>
         <w:t>conftest</w:t>
@@ -1395,7 +1552,12 @@
         <w:t>before</w:t>
       </w:r>
       <w:r>
-        <w:t xml:space="preserve"> merge, and at admission </w:t>
+        <w:t xml:space="preserve"> merge, and at</w:t>
+      </w:r>
+    </w:p>
+    <w:p>
+      <w:r>
+        <w:t xml:space="preserve">admission </w:t>
       </w:r>
       <w:r>
         <w:rPr>
@@ -1404,16 +1566,22 @@
         <w:t>on the cluster</w:t>
       </w:r>
       <w:r>
-        <w:t>. A violation caught in CI is a PR comment; the same violation at admission is a hard reject.</w:t>
+        <w:t>. A violation caught in CI is a PR comment; the same</w:t>
+      </w:r>
+    </w:p>
+    <w:p>
+      <w:r>
+        <w:t>violation at admission is a hard reject.</w:t>
       </w:r>
     </w:p>
     <w:p>
       <w:pPr>
-        <w:spacing w:before="120" w:after="120"/>
+        <w:spacing w:after="160"/>
+        <w:shd w:fill="F5F5F5" w:val="clear"/>
       </w:pPr>
       <w:r>
         <w:rPr>
-          <w:rFonts w:ascii="Courier New" w:hAnsi="Courier New"/>
+          <w:rFonts w:ascii="Consolas" w:hAnsi="Consolas"/>
           <w:color w:val="333333"/>
           <w:sz w:val="18"/>
         </w:rPr>
@@ -1468,7 +1636,8 @@
       </w:r>
       <w:r>
         <w:rPr>
-          <w:rFonts w:ascii="Courier New" w:hAnsi="Courier New"/>
+          <w:rFonts w:ascii="Consolas" w:hAnsi="Consolas"/>
+          <w:color w:val="CC0000"/>
           <w:sz w:val="20"/>
         </w:rPr>
         <w:t>kubectl apply</w:t>
@@ -1492,7 +1661,8 @@
       </w:r>
       <w:r>
         <w:rPr>
-          <w:rFonts w:ascii="Courier New" w:hAnsi="Courier New"/>
+          <w:rFonts w:ascii="Consolas" w:hAnsi="Consolas"/>
+          <w:color w:val="CC0000"/>
           <w:sz w:val="20"/>
         </w:rPr>
         <w:t>kustomize</w:t>
@@ -1503,7 +1673,7 @@
     </w:p>
     <w:p>
       <w:r>
-        <w:t>for the prod branch).</w:t>
+        <w:t xml:space="preserve">   for the prod branch).</w:t>
       </w:r>
     </w:p>
     <w:p>
@@ -1521,7 +1691,8 @@
       </w:r>
       <w:r>
         <w:rPr>
-          <w:rFonts w:ascii="Courier New" w:hAnsi="Courier New"/>
+          <w:rFonts w:ascii="Consolas" w:hAnsi="Consolas"/>
+          <w:color w:val="CC0000"/>
           <w:sz w:val="20"/>
         </w:rPr>
         <w:t>kubeval</w:t>
@@ -1531,7 +1702,8 @@
       </w:r>
       <w:r>
         <w:rPr>
-          <w:rFonts w:ascii="Courier New" w:hAnsi="Courier New"/>
+          <w:rFonts w:ascii="Consolas" w:hAnsi="Consolas"/>
+          <w:color w:val="CC0000"/>
           <w:sz w:val="20"/>
         </w:rPr>
         <w:t>conftest</w:t>
@@ -1542,7 +1714,7 @@
     </w:p>
     <w:p>
       <w:r>
-        <w:t>staging deployment proves the change doesn't break.</w:t>
+        <w:t xml:space="preserve">   staging deployment proves the change doesn't break.</w:t>
       </w:r>
     </w:p>
     <w:p>
@@ -1575,7 +1747,7 @@
     </w:p>
     <w:p>
       <w:r>
-        <w:t>cluster state to match Git.</w:t>
+        <w:t xml:space="preserve">   cluster state to match Git.</w:t>
       </w:r>
     </w:p>
     <w:p>
@@ -1594,12 +1766,22 @@
     </w:p>
     <w:p>
       <w:r>
-        <w:t>drift and either alerts or auto-reverts.</w:t>
+        <w:t xml:space="preserve">   drift and either alerts or auto-reverts.</w:t>
       </w:r>
     </w:p>
     <w:p>
       <w:r>
-        <w:t>This gives you a complete audit trail (Git history), separation of duties (developer proposes, SRE approves), and reproducibility (any cluster state can be rebuilt from Git).</w:t>
+        <w:t>This gives you a complete audit trail (Git history), separation of duties (developer</w:t>
+      </w:r>
+    </w:p>
+    <w:p>
+      <w:r>
+        <w:t>proposes, SRE approves), and reproducibility (any cluster state can be rebuilt from</w:t>
+      </w:r>
+    </w:p>
+    <w:p>
+      <w:r>
+        <w:t>Git).</w:t>
       </w:r>
     </w:p>
     <w:p>
@@ -1633,9 +1815,6 @@
           </w:tcPr>
           <w:p>
             <w:r>
-              <w:rPr>
-                <w:b/>
-              </w:rPr>
               <w:t>Layer</w:t>
             </w:r>
           </w:p>
@@ -1646,9 +1825,6 @@
           </w:tcPr>
           <w:p>
             <w:r>
-              <w:rPr>
-                <w:b/>
-              </w:rPr>
               <w:t>Tool</w:t>
             </w:r>
           </w:p>
@@ -1659,9 +1835,6 @@
           </w:tcPr>
           <w:p>
             <w:r>
-              <w:rPr>
-                <w:b/>
-              </w:rPr>
               <w:t>Policy scope</w:t>
             </w:r>
           </w:p>
@@ -1798,7 +1971,12 @@
     </w:tbl>
     <w:p>
       <w:r>
-        <w:t xml:space="preserve">Each layer adds capability but also latency (~1-3ms per L7 hop). Place policies at the </w:t>
+        <w:t>Each layer adds capability but also latency (~1-3ms per L7 hop). Place policies at</w:t>
+      </w:r>
+    </w:p>
+    <w:p>
+      <w:r>
+        <w:t xml:space="preserve">the </w:t>
       </w:r>
       <w:r>
         <w:rPr>
@@ -1807,11 +1985,24 @@
         <w:t>lowest layer</w:t>
       </w:r>
       <w:r>
-        <w:t xml:space="preserve"> that has the information needed to decide. TLS at the edge, auth at the gateway, service identity at the mesh, business logic in the app.</w:t>
+        <w:t xml:space="preserve"> that has the information needed to decide. TLS at the edge,</w:t>
       </w:r>
     </w:p>
     <w:p>
       <w:r>
+        <w:t>auth at the gateway, service identity at the mesh, business logic in the app.</w:t>
+      </w:r>
+    </w:p>
+    <w:p>
+      <w:pPr>
+        <w:jc w:val="center"/>
+      </w:pPr>
+      <w:r>
+        <w:rPr>
+          <w:i/>
+          <w:color w:val="666666"/>
+          <w:sz w:val="20"/>
+        </w:rPr>
         <w:t>Diagram: 22-l7-layers — the four-layer L7 stack</w:t>
       </w:r>
     </w:p>
@@ -1829,41 +2020,50 @@
       </w:r>
       <w:r>
         <w:rPr>
-          <w:rFonts w:ascii="Courier New" w:hAnsi="Courier New"/>
+          <w:rFonts w:ascii="Consolas" w:hAnsi="Consolas"/>
+          <w:color w:val="CC0000"/>
           <w:sz w:val="20"/>
         </w:rPr>
         <w:t>AuthorizationPolicy</w:t>
       </w:r>
       <w:r>
-        <w:t xml:space="preserve"> provides </w:t>
+        <w:t xml:space="preserve"> provides **namespace-scoped,</w:t>
+      </w:r>
+    </w:p>
+    <w:p>
+      <w:r>
+        <w:t>identity-based access control**. Every workload gets a SPIFFE identity</w:t>
+      </w:r>
+    </w:p>
+    <w:p>
+      <w:r>
+        <w:t>(</w:t>
       </w:r>
       <w:r>
         <w:rPr>
-          <w:b/>
-        </w:rPr>
-        <w:t>namespace-scoped, identity-based access control</w:t>
-      </w:r>
-      <w:r>
-        <w:t>. Every workload gets a SPIFFE identity (</w:t>
-      </w:r>
-      <w:r>
-        <w:rPr>
-          <w:rFonts w:ascii="Courier New" w:hAnsi="Courier New"/>
+          <w:rFonts w:ascii="Consolas" w:hAnsi="Consolas"/>
+          <w:color w:val="CC0000"/>
           <w:sz w:val="20"/>
         </w:rPr>
         <w:t>cluster.local/ns/&lt;namespace&gt;/sa/&lt;service-account&gt;</w:t>
       </w:r>
       <w:r>
-        <w:t>), and policies control which identities can call which endpoints:</w:t>
+        <w:t>), and policies control which</w:t>
+      </w:r>
+    </w:p>
+    <w:p>
+      <w:r>
+        <w:t>identities can call which endpoints:</w:t>
       </w:r>
     </w:p>
     <w:p>
       <w:pPr>
-        <w:spacing w:before="120" w:after="120"/>
+        <w:spacing w:after="160"/>
+        <w:shd w:fill="F5F5F5" w:val="clear"/>
       </w:pPr>
       <w:r>
         <w:rPr>
-          <w:rFonts w:ascii="Courier New" w:hAnsi="Courier New"/>
+          <w:rFonts w:ascii="Consolas" w:hAnsi="Consolas"/>
           <w:color w:val="333333"/>
           <w:sz w:val="18"/>
         </w:rPr>
@@ -1915,7 +2115,32 @@
         <w:t>zero-trust at the service level</w:t>
       </w:r>
       <w:r>
-        <w:t>: even if a pod is compromised, it can only call the exact endpoints its identity is authorized for. Combined with mTLS (which the mesh enables by default), every service-to-service call is authenticated with cryptographic identity, encrypted in transit, and authorized against a declared policy. The application code does not need to implement any of this — the mesh enforces it transparently via the sidecar proxy.</w:t>
+        <w:t>: even if a pod is compromised, it can</w:t>
+      </w:r>
+    </w:p>
+    <w:p>
+      <w:r>
+        <w:t>only call the exact endpoints its identity is authorized for. Combined with mTLS</w:t>
+      </w:r>
+    </w:p>
+    <w:p>
+      <w:r>
+        <w:t>(which the mesh enables by default), every service-to-service call is authenticated</w:t>
+      </w:r>
+    </w:p>
+    <w:p>
+      <w:r>
+        <w:t>with cryptographic identity, encrypted in transit, and authorized against a declared</w:t>
+      </w:r>
+    </w:p>
+    <w:p>
+      <w:r>
+        <w:t>policy. The application code does not need to implement any of this — the mesh</w:t>
+      </w:r>
+    </w:p>
+    <w:p>
+      <w:r>
+        <w:t>enforces it transparently via the sidecar proxy.</w:t>
       </w:r>
     </w:p>
     <w:p>
@@ -1928,7 +2153,12 @@
     </w:p>
     <w:p>
       <w:r>
-        <w:t>L7 routing enables environment-safe deployments without modifying RBAC or network policies:</w:t>
+        <w:t>L7 routing enables environment-safe deployments without modifying RBAC or network</w:t>
+      </w:r>
+    </w:p>
+    <w:p>
+      <w:r>
+        <w:t>policies:</w:t>
       </w:r>
     </w:p>
     <w:p>
@@ -1947,7 +2177,7 @@
     </w:p>
     <w:p>
       <w:r>
-        <w:t>increase. Rollback = set weight to 0.</w:t>
+        <w:t xml:space="preserve">  increase. Rollback = set weight to 0.</w:t>
       </w:r>
     </w:p>
     <w:p>
@@ -1966,7 +2196,7 @@
     </w:p>
     <w:p>
       <w:r>
-        <w:t>the VirtualService.</w:t>
+        <w:t xml:space="preserve">  the VirtualService.</w:t>
       </w:r>
     </w:p>
     <w:p>
@@ -1984,7 +2214,8 @@
       </w:r>
       <w:r>
         <w:rPr>
-          <w:rFonts w:ascii="Courier New" w:hAnsi="Courier New"/>
+          <w:rFonts w:ascii="Consolas" w:hAnsi="Consolas"/>
+          <w:color w:val="CC0000"/>
           <w:sz w:val="20"/>
         </w:rPr>
         <w:t>x-canary: true</w:t>
@@ -1995,7 +2226,7 @@
     </w:p>
     <w:p>
       <w:r>
-        <w:t>version. Only opted-in developers or QA see it. Production users are unaffected.</w:t>
+        <w:t xml:space="preserve">  version. Only opted-in developers or QA see it. Production users are unaffected.</w:t>
       </w:r>
     </w:p>
     <w:p>
@@ -2014,16 +2245,17 @@
     </w:p>
     <w:p>
       <w:r>
-        <w:t>affecting responses. Validate behavior under real load with zero risk.</w:t>
+        <w:t xml:space="preserve">  affecting responses. Validate behavior under real load with zero risk.</w:t>
       </w:r>
     </w:p>
     <w:p>
       <w:pPr>
-        <w:spacing w:before="120" w:after="120"/>
+        <w:spacing w:after="160"/>
+        <w:shd w:fill="F5F5F5" w:val="clear"/>
       </w:pPr>
       <w:r>
         <w:rPr>
-          <w:rFonts w:ascii="Courier New" w:hAnsi="Courier New"/>
+          <w:rFonts w:ascii="Consolas" w:hAnsi="Consolas"/>
           <w:color w:val="333333"/>
           <w:sz w:val="18"/>
         </w:rPr>
@@ -2061,7 +2293,15 @@
       </w:r>
     </w:p>
     <w:p>
-      <w:r>
+      <w:pPr>
+        <w:jc w:val="center"/>
+      </w:pPr>
+      <w:r>
+        <w:rPr>
+          <w:i/>
+          <w:color w:val="666666"/>
+          <w:sz w:val="20"/>
+        </w:rPr>
         <w:t>Diagram: 22-traffic-steering — six release shapes</w:t>
       </w:r>
     </w:p>
@@ -2145,16 +2385,22 @@
     </w:p>
     <w:p>
       <w:r>
-        <w:t>Together, these prevent one team's namespace from consuming cluster resources, accessing another team's data, or receiving traffic it shouldn't.</w:t>
+        <w:t>Together, these prevent one team's namespace from consuming cluster resources,</w:t>
+      </w:r>
+    </w:p>
+    <w:p>
+      <w:r>
+        <w:t>accessing another team's data, or receiving traffic it shouldn't.</w:t>
       </w:r>
     </w:p>
     <w:p>
       <w:pPr>
-        <w:spacing w:before="120" w:after="120"/>
+        <w:spacing w:after="160"/>
+        <w:shd w:fill="F5F5F5" w:val="clear"/>
       </w:pPr>
       <w:r>
         <w:rPr>
-          <w:rFonts w:ascii="Courier New" w:hAnsi="Courier New"/>
+          <w:rFonts w:ascii="Consolas" w:hAnsi="Consolas"/>
           <w:color w:val="333333"/>
           <w:sz w:val="18"/>
         </w:rPr>
@@ -2197,7 +2443,12 @@
     </w:p>
     <w:p>
       <w:r>
-        <w:t>Every policy change — NetworkPolicy, RBAC Role, OPA Constraint — flows through the same validation pipeline before reaching any cluster:</w:t>
+        <w:t>Every policy change — NetworkPolicy, RBAC Role, OPA Constraint — flows through the</w:t>
+      </w:r>
+    </w:p>
+    <w:p>
+      <w:r>
+        <w:t>same validation pipeline before reaching any cluster:</w:t>
       </w:r>
     </w:p>
     <w:tbl>
@@ -2218,9 +2469,6 @@
           </w:tcPr>
           <w:p>
             <w:r>
-              <w:rPr>
-                <w:b/>
-              </w:rPr>
               <w:t>Stage</w:t>
             </w:r>
           </w:p>
@@ -2231,9 +2479,6 @@
           </w:tcPr>
           <w:p>
             <w:r>
-              <w:rPr>
-                <w:b/>
-              </w:rPr>
               <w:t>Tool</w:t>
             </w:r>
           </w:p>
@@ -2244,9 +2489,6 @@
           </w:tcPr>
           <w:p>
             <w:r>
-              <w:rPr>
-                <w:b/>
-              </w:rPr>
               <w:t>What it catches</w:t>
             </w:r>
           </w:p>
@@ -2488,17 +2730,38 @@
         <w:t>the CI pipeline is the only path to production.</w:t>
       </w:r>
       <w:r>
-        <w:t xml:space="preserve"> No exceptions, no emergency </w:t>
+        <w:t xml:space="preserve"> No exceptions,</w:t>
+      </w:r>
+    </w:p>
+    <w:p>
+      <w:r>
+        <w:t xml:space="preserve">no emergency </w:t>
       </w:r>
       <w:r>
         <w:rPr>
-          <w:rFonts w:ascii="Courier New" w:hAnsi="Courier New"/>
+          <w:rFonts w:ascii="Consolas" w:hAnsi="Consolas"/>
+          <w:color w:val="CC0000"/>
           <w:sz w:val="20"/>
         </w:rPr>
         <w:t>kubectl apply</w:t>
       </w:r>
       <w:r>
-        <w:t>, no "just this once." If the pipeline is too slow for emergencies, fix the pipeline — don't bypass it. Every stage produces artifacts — schema validation results, policy compliance reports, staging test results — that feed the audit trail.</w:t>
+        <w:t>, no "just this once." If the pipeline is too slow for</w:t>
+      </w:r>
+    </w:p>
+    <w:p>
+      <w:r>
+        <w:t>emergencies, fix the pipeline — don't bypass it. Every stage produces artifacts —</w:t>
+      </w:r>
+    </w:p>
+    <w:p>
+      <w:r>
+        <w:t>schema validation results, policy compliance reports, staging test results — that</w:t>
+      </w:r>
+    </w:p>
+    <w:p>
+      <w:r>
+        <w:t>feed the audit trail.</w:t>
       </w:r>
     </w:p>
     <w:p>
@@ -2529,7 +2792,8 @@
       </w:r>
       <w:r>
         <w:rPr>
-          <w:rFonts w:ascii="Courier New" w:hAnsi="Courier New"/>
+          <w:rFonts w:ascii="Consolas" w:hAnsi="Consolas"/>
+          <w:color w:val="CC0000"/>
           <w:sz w:val="20"/>
         </w:rPr>
         <w:t>kubectl</w:t>
@@ -2540,11 +2804,12 @@
     </w:p>
     <w:p>
       <w:r>
-        <w:t xml:space="preserve">identity, timestamp, resource, and verb. Configure at the </w:t>
+        <w:t xml:space="preserve">  identity, timestamp, resource, and verb. Configure at the </w:t>
       </w:r>
       <w:r>
         <w:rPr>
-          <w:rFonts w:ascii="Courier New" w:hAnsi="Courier New"/>
+          <w:rFonts w:ascii="Consolas" w:hAnsi="Consolas"/>
+          <w:color w:val="CC0000"/>
           <w:sz w:val="20"/>
         </w:rPr>
         <w:t>Metadata</w:t>
@@ -2554,13 +2819,16 @@
       </w:r>
       <w:r>
         <w:rPr>
-          <w:rFonts w:ascii="Courier New" w:hAnsi="Courier New"/>
+          <w:rFonts w:ascii="Consolas" w:hAnsi="Consolas"/>
+          <w:color w:val="CC0000"/>
           <w:sz w:val="20"/>
         </w:rPr>
         <w:t>Request</w:t>
       </w:r>
-      <w:r>
-        <w:t xml:space="preserve"> level for sensitive resources (Secrets, RBAC, NetworkPolicies).</w:t>
+    </w:p>
+    <w:p>
+      <w:r>
+        <w:t xml:space="preserve">  level for sensitive resources (Secrets, RBAC, NetworkPolicies).</w:t>
       </w:r>
     </w:p>
     <w:p>
@@ -2579,7 +2847,7 @@
     </w:p>
     <w:p>
       <w:r>
-        <w:t>matched and the object that triggered it.</w:t>
+        <w:t xml:space="preserve">  matched and the object that triggered it.</w:t>
       </w:r>
     </w:p>
     <w:p>
@@ -2598,7 +2866,12 @@
     </w:p>
     <w:p>
       <w:r>
-        <w:t>commit with author, reviewer, timestamp, and diff. This is the audit trail compliance teams want.</w:t>
+        <w:t xml:space="preserve">  commit with author, reviewer, timestamp, and diff. This is the audit trail</w:t>
+      </w:r>
+    </w:p>
+    <w:p>
+      <w:r>
+        <w:t xml:space="preserve">  compliance teams want.</w:t>
       </w:r>
     </w:p>
     <w:p>
@@ -2617,7 +2890,7 @@
     </w:p>
     <w:p>
       <w:r>
-        <w:t>bindings. Verify no human has cluster-admin.</w:t>
+        <w:t xml:space="preserve">  bindings. Verify no human has cluster-admin.</w:t>
       </w:r>
     </w:p>
     <w:p>
@@ -2636,11 +2909,12 @@
     </w:p>
     <w:p>
       <w:r>
-        <w:t xml:space="preserve">Tools like </w:t>
+        <w:t xml:space="preserve">  Tools like </w:t>
       </w:r>
       <w:r>
         <w:rPr>
-          <w:rFonts w:ascii="Courier New" w:hAnsi="Courier New"/>
+          <w:rFonts w:ascii="Consolas" w:hAnsi="Consolas"/>
+          <w:color w:val="CC0000"/>
           <w:sz w:val="20"/>
         </w:rPr>
         <w:t>kubectl np-viewer</w:t>
@@ -2675,9 +2949,6 @@
           </w:tcPr>
           <w:p>
             <w:r>
-              <w:rPr>
-                <w:b/>
-              </w:rPr>
               <w:t>Anti-pattern</w:t>
             </w:r>
           </w:p>
@@ -2688,9 +2959,6 @@
           </w:tcPr>
           <w:p>
             <w:r>
-              <w:rPr>
-                <w:b/>
-              </w:rPr>
               <w:t>Why it's dangerous</w:t>
             </w:r>
           </w:p>
@@ -2701,9 +2969,6 @@
           </w:tcPr>
           <w:p>
             <w:r>
-              <w:rPr>
-                <w:b/>
-              </w:rPr>
               <w:t>Fix</w:t>
             </w:r>
           </w:p>
@@ -2934,7 +3199,7 @@
     </w:p>
     <w:p>
       <w:r>
-        <w:t>measure.</w:t>
+        <w:t xml:space="preserve">   measure.</w:t>
       </w:r>
     </w:p>
     <w:p>
@@ -2952,7 +3217,8 @@
       </w:r>
       <w:r>
         <w:rPr>
-          <w:rFonts w:ascii="Courier New" w:hAnsi="Courier New"/>
+          <w:rFonts w:ascii="Consolas" w:hAnsi="Consolas"/>
+          <w:color w:val="CC0000"/>
           <w:sz w:val="20"/>
         </w:rPr>
         <w:t>edit</w:t>
@@ -2962,7 +3228,8 @@
       </w:r>
       <w:r>
         <w:rPr>
-          <w:rFonts w:ascii="Courier New" w:hAnsi="Courier New"/>
+          <w:rFonts w:ascii="Consolas" w:hAnsi="Consolas"/>
+          <w:color w:val="CC0000"/>
           <w:sz w:val="20"/>
         </w:rPr>
         <w:t>view</w:t>
@@ -2973,7 +3240,7 @@
     </w:p>
     <w:p>
       <w:r>
-        <w:t>CI/CD as the only deploy path.</w:t>
+        <w:t xml:space="preserve">   CI/CD as the only deploy path.</w:t>
       </w:r>
     </w:p>
     <w:p>
@@ -2991,7 +3258,8 @@
       </w:r>
       <w:r>
         <w:rPr>
-          <w:rFonts w:ascii="Courier New" w:hAnsi="Courier New"/>
+          <w:rFonts w:ascii="Consolas" w:hAnsi="Consolas"/>
+          <w:color w:val="CC0000"/>
           <w:sz w:val="20"/>
         </w:rPr>
         <w:t>conftest</w:t>
@@ -3002,7 +3270,7 @@
     </w:p>
     <w:p>
       <w:r>
-        <w:t>same policies in both.</w:t>
+        <w:t xml:space="preserve">   same policies in both.</w:t>
       </w:r>
     </w:p>
     <w:p>
@@ -3020,7 +3288,8 @@
       </w:r>
       <w:r>
         <w:rPr>
-          <w:rFonts w:ascii="Courier New" w:hAnsi="Courier New"/>
+          <w:rFonts w:ascii="Consolas" w:hAnsi="Consolas"/>
+          <w:color w:val="CC0000"/>
           <w:sz w:val="20"/>
         </w:rPr>
         <w:t>kubectl apply</w:t>
@@ -3031,7 +3300,7 @@
     </w:p>
     <w:p>
       <w:r>
-        <w:t>detection enabled.</w:t>
+        <w:t xml:space="preserve">   detection enabled.</w:t>
       </w:r>
     </w:p>
     <w:p>
@@ -3050,7 +3319,7 @@
     </w:p>
     <w:p>
       <w:r>
-        <w:t>namespace per team.</w:t>
+        <w:t xml:space="preserve">   namespace per team.</w:t>
       </w:r>
     </w:p>
     <w:p>
@@ -3069,7 +3338,7 @@
     </w:p>
     <w:p>
       <w:r>
-        <w:t>the source of truth.</w:t>
+        <w:t xml:space="preserve">   the source of truth.</w:t>
       </w:r>
     </w:p>
     <w:p>
@@ -3088,7 +3357,17 @@
     </w:p>
     <w:p>
       <w:r>
-        <w:t>The order matters: default-deny and RBAC tiering give you the most security for the least effort, while GitOps and policy-as-code take more infrastructure investment but close the remaining gaps. Start with the first two this week.</w:t>
+        <w:t>The order matters: default-deny and RBAC tiering give you the most security for the</w:t>
+      </w:r>
+    </w:p>
+    <w:p>
+      <w:r>
+        <w:t>least effort, while GitOps and policy-as-code take more infrastructure investment but</w:t>
+      </w:r>
+    </w:p>
+    <w:p>
+      <w:r>
+        <w:t>close the remaining gaps. Start with the first two this week.</w:t>
       </w:r>
     </w:p>
     <w:p>
@@ -3105,7 +3384,7 @@
       </w:pPr>
       <w:r>
         <w:rPr>
-          <w:color w:val="00568B"/>
+          <w:color w:val="0066CC"/>
           <w:u w:val="single"/>
         </w:rPr>
         <w:t>Kubernetes RBAC Good Practices</w:t>
@@ -3117,7 +3396,7 @@
       </w:pPr>
       <w:r>
         <w:rPr>
-          <w:color w:val="00568B"/>
+          <w:color w:val="0066CC"/>
           <w:u w:val="single"/>
         </w:rPr>
         <w:t>Kubernetes Network Policies</w:t>
@@ -3129,7 +3408,7 @@
       </w:pPr>
       <w:r>
         <w:rPr>
-          <w:color w:val="00568B"/>
+          <w:color w:val="0066CC"/>
           <w:u w:val="single"/>
         </w:rPr>
         <w:t>OPA Gatekeeper</w:t>
@@ -3141,7 +3420,7 @@
       </w:pPr>
       <w:r>
         <w:rPr>
-          <w:color w:val="00568B"/>
+          <w:color w:val="0066CC"/>
           <w:u w:val="single"/>
         </w:rPr>
         <w:t>Kyverno</w:t>
@@ -3153,7 +3432,7 @@
       </w:pPr>
       <w:r>
         <w:rPr>
-          <w:color w:val="00568B"/>
+          <w:color w:val="0066CC"/>
           <w:u w:val="single"/>
         </w:rPr>
         <w:t>Istio AuthorizationPolicy</w:t>
@@ -3165,7 +3444,7 @@
       </w:pPr>
       <w:r>
         <w:rPr>
-          <w:color w:val="00568B"/>
+          <w:color w:val="0066CC"/>
           <w:u w:val="single"/>
         </w:rPr>
         <w:t>ArgoCD</w:t>
@@ -3175,7 +3454,7 @@
       </w:r>
       <w:r>
         <w:rPr>
-          <w:color w:val="00568B"/>
+          <w:color w:val="0066CC"/>
           <w:u w:val="single"/>
         </w:rPr>
         <w:t>Flux</w:t>
@@ -3187,7 +3466,7 @@
       </w:pPr>
       <w:r>
         <w:rPr>
-          <w:color w:val="00568B"/>
+          <w:color w:val="0066CC"/>
           <w:u w:val="single"/>
         </w:rPr>
         <w:t>CNCF Cloud Native Security Whitepaper</w:t>
@@ -3199,7 +3478,7 @@
       </w:pPr>
       <w:r>
         <w:rPr>
-          <w:color w:val="00568B"/>
+          <w:color w:val="0066CC"/>
           <w:u w:val="single"/>
         </w:rPr>
         <w:t>Pod Security Standards</w:t>
@@ -3211,7 +3490,7 @@
       </w:pPr>
       <w:r>
         <w:rPr>
-          <w:color w:val="00568B"/>
+          <w:color w:val="0066CC"/>
           <w:u w:val="single"/>
         </w:rPr>
         <w:t>SPIFFE / SPIRE</w:t>
@@ -3592,7 +3871,7 @@
     <w:rsid w:val="00FC693F"/>
     <w:rPr>
       <w:rFonts w:ascii="Calibri" w:hAnsi="Calibri"/>
-      <w:sz w:val="22"/>
+      <w:sz w:val="18"/>
     </w:rPr>
   </w:style>
   <w:style w:type="paragraph" w:styleId="Header">

</xml_diff>

<commit_message>
docs(deck): refresh the K8s environment access policies deck (S12)
</commit_message>
<xml_diff>
--- a/lgtm-presentation/k8s-environment-policies.docx
+++ b/lgtm-presentation/k8s-environment-policies.docx
@@ -111,7 +111,7 @@
         <w:pStyle w:val="Heading2"/>
       </w:pPr>
       <w:r>
-        <w:t>2. Three environments, three risk profiles</w:t>
+        <w:t>2. Risk profiles by environment</w:t>
       </w:r>
     </w:p>
     <w:p>
@@ -1695,7 +1695,7 @@
           <w:color w:val="CC0000"/>
           <w:sz w:val="20"/>
         </w:rPr>
-        <w:t>kubeval</w:t>
+        <w:t>kubeconform</w:t>
       </w:r>
       <w:r>
         <w:t xml:space="preserve"> checks schema, </w:t>
@@ -2511,7 +2511,7 @@
           </w:tcPr>
           <w:p>
             <w:r>
-              <w:t>kubeval, kubeconform</w:t>
+              <w:t>kubeconform v0.8.0</w:t>
             </w:r>
           </w:p>
         </w:tc>

</xml_diff>